<commit_message>
added rest of the chapters
</commit_message>
<xml_diff>
--- a/Documentation.docx
+++ b/Documentation.docx
@@ -13,9 +13,6 @@
       <w:sdtContent>
         <w:p>
           <w:r>
-            <w:rPr>
-              <w:noProof/>
-            </w:rPr>
             <mc:AlternateContent>
               <mc:Choice Requires="wpg">
                 <w:drawing>
@@ -125,6 +122,7 @@
                                   <w:sdtPr>
                                     <w:rPr>
                                       <w:color w:val="FFFFFF" w:themeColor="background1"/>
+                                      <w:lang w:val="en-GB"/>
                                     </w:rPr>
                                     <w:alias w:val="Tekijä"/>
                                     <w:tag w:val=""/>
@@ -140,11 +138,13 @@
                                         <w:jc w:val="center"/>
                                         <w:rPr>
                                           <w:color w:val="FFFFFF" w:themeColor="background1"/>
+                                          <w:lang w:val="en-GB"/>
                                         </w:rPr>
                                       </w:pPr>
                                       <w:r>
                                         <w:rPr>
                                           <w:color w:val="FFFFFF" w:themeColor="background1"/>
+                                          <w:lang w:val="en-GB"/>
                                         </w:rPr>
                                         <w:t>Toni Heikkilä</w:t>
                                       </w:r>
@@ -158,6 +158,7 @@
                                     <w:jc w:val="center"/>
                                     <w:rPr>
                                       <w:color w:val="FFFFFF" w:themeColor="background1"/>
+                                      <w:lang w:val="en-GB"/>
                                     </w:rPr>
                                   </w:pPr>
                                   <w:sdt>
@@ -165,6 +166,7 @@
                                       <w:rPr>
                                         <w:caps/>
                                         <w:color w:val="FFFFFF" w:themeColor="background1"/>
+                                        <w:lang w:val="en-GB"/>
                                       </w:rPr>
                                       <w:alias w:val="Yritys"/>
                                       <w:tag w:val=""/>
@@ -177,6 +179,7 @@
                                         <w:rPr>
                                           <w:caps/>
                                           <w:color w:val="FFFFFF" w:themeColor="background1"/>
+                                          <w:lang w:val="en-GB"/>
                                         </w:rPr>
                                         <w:t>tampereen university</w:t>
                                       </w:r>
@@ -185,6 +188,7 @@
                                   <w:r>
                                     <w:rPr>
                                       <w:color w:val="FFFFFF" w:themeColor="background1"/>
+                                      <w:lang w:val="en-GB"/>
                                     </w:rPr>
                                     <w:t>  </w:t>
                                   </w:r>
@@ -192,6 +196,7 @@
                                     <w:sdtPr>
                                       <w:rPr>
                                         <w:color w:val="FFFFFF" w:themeColor="background1"/>
+                                        <w:lang w:val="en-GB"/>
                                       </w:rPr>
                                       <w:alias w:val="Osoite"/>
                                       <w:tag w:val=""/>
@@ -204,6 +209,7 @@
                                       <w:r>
                                         <w:rPr>
                                           <w:color w:val="FFFFFF" w:themeColor="background1"/>
+                                          <w:lang w:val="en-GB"/>
                                         </w:rPr>
                                         <w:t xml:space="preserve">     </w:t>
                                       </w:r>
@@ -262,6 +268,7 @@
                                       <w:color w:val="156082" w:themeColor="accent1"/>
                                       <w:sz w:val="72"/>
                                       <w:szCs w:val="72"/>
+                                      <w:lang w:val="en-GB"/>
                                     </w:rPr>
                                     <w:alias w:val="Otsikko"/>
                                     <w:tag w:val=""/>
@@ -280,6 +287,7 @@
                                           <w:color w:val="156082" w:themeColor="accent1"/>
                                           <w:sz w:val="72"/>
                                           <w:szCs w:val="72"/>
+                                          <w:lang w:val="en-GB"/>
                                         </w:rPr>
                                       </w:pPr>
                                       <w:r>
@@ -289,6 +297,7 @@
                                           <w:color w:val="156082" w:themeColor="accent1"/>
                                           <w:sz w:val="72"/>
                                           <w:szCs w:val="72"/>
+                                          <w:lang w:val="en-GB"/>
                                         </w:rPr>
                                         <w:t>MyManager</w:t>
                                       </w:r>
@@ -327,6 +336,7 @@
                             <w:sdtPr>
                               <w:rPr>
                                 <w:color w:val="FFFFFF" w:themeColor="background1"/>
+                                <w:lang w:val="en-GB"/>
                               </w:rPr>
                               <w:alias w:val="Tekijä"/>
                               <w:tag w:val=""/>
@@ -342,11 +352,13 @@
                                   <w:jc w:val="center"/>
                                   <w:rPr>
                                     <w:color w:val="FFFFFF" w:themeColor="background1"/>
+                                    <w:lang w:val="en-GB"/>
                                   </w:rPr>
                                 </w:pPr>
                                 <w:r>
                                   <w:rPr>
                                     <w:color w:val="FFFFFF" w:themeColor="background1"/>
+                                    <w:lang w:val="en-GB"/>
                                   </w:rPr>
                                   <w:t>Toni Heikkilä</w:t>
                                 </w:r>
@@ -360,6 +372,7 @@
                               <w:jc w:val="center"/>
                               <w:rPr>
                                 <w:color w:val="FFFFFF" w:themeColor="background1"/>
+                                <w:lang w:val="en-GB"/>
                               </w:rPr>
                             </w:pPr>
                             <w:sdt>
@@ -367,6 +380,7 @@
                                 <w:rPr>
                                   <w:caps/>
                                   <w:color w:val="FFFFFF" w:themeColor="background1"/>
+                                  <w:lang w:val="en-GB"/>
                                 </w:rPr>
                                 <w:alias w:val="Yritys"/>
                                 <w:tag w:val=""/>
@@ -379,6 +393,7 @@
                                   <w:rPr>
                                     <w:caps/>
                                     <w:color w:val="FFFFFF" w:themeColor="background1"/>
+                                    <w:lang w:val="en-GB"/>
                                   </w:rPr>
                                   <w:t>tampereen university</w:t>
                                 </w:r>
@@ -387,6 +402,7 @@
                             <w:r>
                               <w:rPr>
                                 <w:color w:val="FFFFFF" w:themeColor="background1"/>
+                                <w:lang w:val="en-GB"/>
                               </w:rPr>
                               <w:t>  </w:t>
                             </w:r>
@@ -394,6 +410,7 @@
                               <w:sdtPr>
                                 <w:rPr>
                                   <w:color w:val="FFFFFF" w:themeColor="background1"/>
+                                  <w:lang w:val="en-GB"/>
                                 </w:rPr>
                                 <w:alias w:val="Osoite"/>
                                 <w:tag w:val=""/>
@@ -406,6 +423,7 @@
                                 <w:r>
                                   <w:rPr>
                                     <w:color w:val="FFFFFF" w:themeColor="background1"/>
+                                    <w:lang w:val="en-GB"/>
                                   </w:rPr>
                                   <w:t xml:space="preserve">     </w:t>
                                 </w:r>
@@ -430,6 +448,7 @@
                                 <w:color w:val="156082" w:themeColor="accent1"/>
                                 <w:sz w:val="72"/>
                                 <w:szCs w:val="72"/>
+                                <w:lang w:val="en-GB"/>
                               </w:rPr>
                               <w:alias w:val="Otsikko"/>
                               <w:tag w:val=""/>
@@ -448,6 +467,7 @@
                                     <w:color w:val="156082" w:themeColor="accent1"/>
                                     <w:sz w:val="72"/>
                                     <w:szCs w:val="72"/>
+                                    <w:lang w:val="en-GB"/>
                                   </w:rPr>
                                 </w:pPr>
                                 <w:r>
@@ -457,6 +477,7 @@
                                     <w:color w:val="156082" w:themeColor="accent1"/>
                                     <w:sz w:val="72"/>
                                     <w:szCs w:val="72"/>
+                                    <w:lang w:val="en-GB"/>
                                   </w:rPr>
                                   <w:t>MyManager</w:t>
                                 </w:r>
@@ -515,20 +536,596 @@
             <w:pStyle w:val="Sisllysluettelonotsikko"/>
           </w:pPr>
           <w:r>
-            <w:t>Sisällys</w:t>
+            <w:t>Table of Contents</w:t>
           </w:r>
         </w:p>
         <w:p>
-          <w:fldSimple w:instr=" TOC \o &quot;1-3&quot; \h \z \u ">
-            <w:r>
-              <w:rPr>
-                <w:b/>
-                <w:bCs/>
-                <w:noProof/>
-              </w:rPr>
-              <w:t>Sisällysluettelon hakusanoja ei löytynyt.</w:t>
-            </w:r>
-          </w:fldSimple>
+          <w:pPr>
+            <w:pStyle w:val="Sisluet2"/>
+            <w:tabs>
+              <w:tab w:val="right" w:leader="dot" w:pos="9628"/>
+            </w:tabs>
+          </w:pPr>
+          <w:r>
+            <w:fldChar w:fldCharType="begin"/>
+          </w:r>
+          <w:r>
+            <w:instrText xml:space="preserve"> TOC \o "1-3" \h \z \u </w:instrText>
+          </w:r>
+          <w:r>
+            <w:fldChar w:fldCharType="separate"/>
+          </w:r>
+          <w:hyperlink w:anchor="_Toc229836484" w:history="1">
+            <w:r>
+              <w:rPr>
+                <w:rStyle w:val="Hyperlinkki"/>
+              </w:rPr>
+              <w:t>General Description</w:t>
+            </w:r>
+            <w:r>
+              <w:rPr>
+                <w:webHidden/>
+              </w:rPr>
+              <w:tab/>
+            </w:r>
+            <w:r>
+              <w:rPr>
+                <w:webHidden/>
+              </w:rPr>
+              <w:fldChar w:fldCharType="begin"/>
+            </w:r>
+            <w:r>
+              <w:rPr>
+                <w:webHidden/>
+              </w:rPr>
+              <w:instrText xml:space="preserve"> PAGEREF _Toc229836484 \h </w:instrText>
+            </w:r>
+            <w:r>
+              <w:rPr>
+                <w:webHidden/>
+              </w:rPr>
+            </w:r>
+            <w:r>
+              <w:rPr>
+                <w:webHidden/>
+              </w:rPr>
+              <w:fldChar w:fldCharType="separate"/>
+            </w:r>
+            <w:r>
+              <w:rPr>
+                <w:webHidden/>
+              </w:rPr>
+              <w:t>2</w:t>
+            </w:r>
+            <w:r>
+              <w:rPr>
+                <w:webHidden/>
+              </w:rPr>
+              <w:fldChar w:fldCharType="end"/>
+            </w:r>
+          </w:hyperlink>
+        </w:p>
+        <w:p>
+          <w:pPr>
+            <w:pStyle w:val="Sisluet3"/>
+            <w:tabs>
+              <w:tab w:val="right" w:leader="dot" w:pos="9628"/>
+            </w:tabs>
+          </w:pPr>
+          <w:hyperlink w:anchor="_Toc229836485" w:history="1">
+            <w:r>
+              <w:rPr>
+                <w:rStyle w:val="Hyperlinkki"/>
+              </w:rPr>
+              <w:t>Installation</w:t>
+            </w:r>
+            <w:r>
+              <w:rPr>
+                <w:webHidden/>
+              </w:rPr>
+              <w:tab/>
+            </w:r>
+            <w:r>
+              <w:rPr>
+                <w:webHidden/>
+              </w:rPr>
+              <w:fldChar w:fldCharType="begin"/>
+            </w:r>
+            <w:r>
+              <w:rPr>
+                <w:webHidden/>
+              </w:rPr>
+              <w:instrText xml:space="preserve"> PAGEREF _Toc229836485 \h </w:instrText>
+            </w:r>
+            <w:r>
+              <w:rPr>
+                <w:webHidden/>
+              </w:rPr>
+            </w:r>
+            <w:r>
+              <w:rPr>
+                <w:webHidden/>
+              </w:rPr>
+              <w:fldChar w:fldCharType="separate"/>
+            </w:r>
+            <w:r>
+              <w:rPr>
+                <w:webHidden/>
+              </w:rPr>
+              <w:t>2</w:t>
+            </w:r>
+            <w:r>
+              <w:rPr>
+                <w:webHidden/>
+              </w:rPr>
+              <w:fldChar w:fldCharType="end"/>
+            </w:r>
+          </w:hyperlink>
+        </w:p>
+        <w:p>
+          <w:pPr>
+            <w:pStyle w:val="Sisluet3"/>
+            <w:tabs>
+              <w:tab w:val="right" w:leader="dot" w:pos="9628"/>
+            </w:tabs>
+          </w:pPr>
+          <w:hyperlink w:anchor="_Toc229836486" w:history="1">
+            <w:r>
+              <w:rPr>
+                <w:rStyle w:val="Hyperlinkki"/>
+              </w:rPr>
+              <w:t>Usage</w:t>
+            </w:r>
+            <w:r>
+              <w:rPr>
+                <w:webHidden/>
+              </w:rPr>
+              <w:tab/>
+            </w:r>
+            <w:r>
+              <w:rPr>
+                <w:webHidden/>
+              </w:rPr>
+              <w:fldChar w:fldCharType="begin"/>
+            </w:r>
+            <w:r>
+              <w:rPr>
+                <w:webHidden/>
+              </w:rPr>
+              <w:instrText xml:space="preserve"> PAGEREF _Toc229836486 \h </w:instrText>
+            </w:r>
+            <w:r>
+              <w:rPr>
+                <w:webHidden/>
+              </w:rPr>
+            </w:r>
+            <w:r>
+              <w:rPr>
+                <w:webHidden/>
+              </w:rPr>
+              <w:fldChar w:fldCharType="separate"/>
+            </w:r>
+            <w:r>
+              <w:rPr>
+                <w:webHidden/>
+              </w:rPr>
+              <w:t>2</w:t>
+            </w:r>
+            <w:r>
+              <w:rPr>
+                <w:webHidden/>
+              </w:rPr>
+              <w:fldChar w:fldCharType="end"/>
+            </w:r>
+          </w:hyperlink>
+        </w:p>
+        <w:p>
+          <w:pPr>
+            <w:pStyle w:val="Sisluet2"/>
+            <w:tabs>
+              <w:tab w:val="right" w:leader="dot" w:pos="9628"/>
+            </w:tabs>
+          </w:pPr>
+          <w:hyperlink w:anchor="_Toc229836487" w:history="1">
+            <w:r>
+              <w:rPr>
+                <w:rStyle w:val="Hyperlinkki"/>
+              </w:rPr>
+              <w:t>Structure of the Program</w:t>
+            </w:r>
+            <w:r>
+              <w:rPr>
+                <w:webHidden/>
+              </w:rPr>
+              <w:tab/>
+            </w:r>
+            <w:r>
+              <w:rPr>
+                <w:webHidden/>
+              </w:rPr>
+              <w:fldChar w:fldCharType="begin"/>
+            </w:r>
+            <w:r>
+              <w:rPr>
+                <w:webHidden/>
+              </w:rPr>
+              <w:instrText xml:space="preserve"> PAGEREF _Toc229836487 \h </w:instrText>
+            </w:r>
+            <w:r>
+              <w:rPr>
+                <w:webHidden/>
+              </w:rPr>
+            </w:r>
+            <w:r>
+              <w:rPr>
+                <w:webHidden/>
+              </w:rPr>
+              <w:fldChar w:fldCharType="separate"/>
+            </w:r>
+            <w:r>
+              <w:rPr>
+                <w:webHidden/>
+              </w:rPr>
+              <w:t>3</w:t>
+            </w:r>
+            <w:r>
+              <w:rPr>
+                <w:webHidden/>
+              </w:rPr>
+              <w:fldChar w:fldCharType="end"/>
+            </w:r>
+          </w:hyperlink>
+        </w:p>
+        <w:p>
+          <w:pPr>
+            <w:pStyle w:val="Sisluet2"/>
+            <w:tabs>
+              <w:tab w:val="right" w:leader="dot" w:pos="9628"/>
+            </w:tabs>
+          </w:pPr>
+          <w:hyperlink w:anchor="_Toc229836488" w:history="1">
+            <w:r>
+              <w:rPr>
+                <w:rStyle w:val="Hyperlinkki"/>
+              </w:rPr>
+              <w:t>Secure Programming Solutions</w:t>
+            </w:r>
+            <w:r>
+              <w:rPr>
+                <w:webHidden/>
+              </w:rPr>
+              <w:tab/>
+            </w:r>
+            <w:r>
+              <w:rPr>
+                <w:webHidden/>
+              </w:rPr>
+              <w:fldChar w:fldCharType="begin"/>
+            </w:r>
+            <w:r>
+              <w:rPr>
+                <w:webHidden/>
+              </w:rPr>
+              <w:instrText xml:space="preserve"> PAGEREF _Toc229836488 \h </w:instrText>
+            </w:r>
+            <w:r>
+              <w:rPr>
+                <w:webHidden/>
+              </w:rPr>
+            </w:r>
+            <w:r>
+              <w:rPr>
+                <w:webHidden/>
+              </w:rPr>
+              <w:fldChar w:fldCharType="separate"/>
+            </w:r>
+            <w:r>
+              <w:rPr>
+                <w:webHidden/>
+              </w:rPr>
+              <w:t>3</w:t>
+            </w:r>
+            <w:r>
+              <w:rPr>
+                <w:webHidden/>
+              </w:rPr>
+              <w:fldChar w:fldCharType="end"/>
+            </w:r>
+          </w:hyperlink>
+        </w:p>
+        <w:p>
+          <w:pPr>
+            <w:pStyle w:val="Sisluet3"/>
+            <w:tabs>
+              <w:tab w:val="right" w:leader="dot" w:pos="9628"/>
+            </w:tabs>
+          </w:pPr>
+          <w:hyperlink w:anchor="_Toc229836489" w:history="1">
+            <w:r>
+              <w:rPr>
+                <w:rStyle w:val="Hyperlinkki"/>
+              </w:rPr>
+              <w:t>OWASP TOP 10</w:t>
+            </w:r>
+            <w:r>
+              <w:rPr>
+                <w:webHidden/>
+              </w:rPr>
+              <w:tab/>
+            </w:r>
+            <w:r>
+              <w:rPr>
+                <w:webHidden/>
+              </w:rPr>
+              <w:fldChar w:fldCharType="begin"/>
+            </w:r>
+            <w:r>
+              <w:rPr>
+                <w:webHidden/>
+              </w:rPr>
+              <w:instrText xml:space="preserve"> PAGEREF _Toc229836489 \h </w:instrText>
+            </w:r>
+            <w:r>
+              <w:rPr>
+                <w:webHidden/>
+              </w:rPr>
+            </w:r>
+            <w:r>
+              <w:rPr>
+                <w:webHidden/>
+              </w:rPr>
+              <w:fldChar w:fldCharType="separate"/>
+            </w:r>
+            <w:r>
+              <w:rPr>
+                <w:webHidden/>
+              </w:rPr>
+              <w:t>3</w:t>
+            </w:r>
+            <w:r>
+              <w:rPr>
+                <w:webHidden/>
+              </w:rPr>
+              <w:fldChar w:fldCharType="end"/>
+            </w:r>
+          </w:hyperlink>
+        </w:p>
+        <w:p>
+          <w:pPr>
+            <w:pStyle w:val="Sisluet2"/>
+            <w:tabs>
+              <w:tab w:val="right" w:leader="dot" w:pos="9628"/>
+            </w:tabs>
+          </w:pPr>
+          <w:hyperlink w:anchor="_Toc229836490" w:history="1">
+            <w:r>
+              <w:rPr>
+                <w:rStyle w:val="Hyperlinkki"/>
+              </w:rPr>
+              <w:t>Testing</w:t>
+            </w:r>
+            <w:r>
+              <w:rPr>
+                <w:webHidden/>
+              </w:rPr>
+              <w:tab/>
+            </w:r>
+            <w:r>
+              <w:rPr>
+                <w:webHidden/>
+              </w:rPr>
+              <w:fldChar w:fldCharType="begin"/>
+            </w:r>
+            <w:r>
+              <w:rPr>
+                <w:webHidden/>
+              </w:rPr>
+              <w:instrText xml:space="preserve"> PAGEREF _Toc229836490 \h </w:instrText>
+            </w:r>
+            <w:r>
+              <w:rPr>
+                <w:webHidden/>
+              </w:rPr>
+            </w:r>
+            <w:r>
+              <w:rPr>
+                <w:webHidden/>
+              </w:rPr>
+              <w:fldChar w:fldCharType="separate"/>
+            </w:r>
+            <w:r>
+              <w:rPr>
+                <w:webHidden/>
+              </w:rPr>
+              <w:t>4</w:t>
+            </w:r>
+            <w:r>
+              <w:rPr>
+                <w:webHidden/>
+              </w:rPr>
+              <w:fldChar w:fldCharType="end"/>
+            </w:r>
+          </w:hyperlink>
+        </w:p>
+        <w:p>
+          <w:pPr>
+            <w:pStyle w:val="Sisluet2"/>
+            <w:tabs>
+              <w:tab w:val="right" w:leader="dot" w:pos="9628"/>
+            </w:tabs>
+          </w:pPr>
+          <w:hyperlink w:anchor="_Toc229836491" w:history="1">
+            <w:r>
+              <w:rPr>
+                <w:rStyle w:val="Hyperlinkki"/>
+              </w:rPr>
+              <w:t>Future implementations</w:t>
+            </w:r>
+            <w:r>
+              <w:rPr>
+                <w:webHidden/>
+              </w:rPr>
+              <w:tab/>
+            </w:r>
+            <w:r>
+              <w:rPr>
+                <w:webHidden/>
+              </w:rPr>
+              <w:fldChar w:fldCharType="begin"/>
+            </w:r>
+            <w:r>
+              <w:rPr>
+                <w:webHidden/>
+              </w:rPr>
+              <w:instrText xml:space="preserve"> PAGEREF _Toc229836491 \h </w:instrText>
+            </w:r>
+            <w:r>
+              <w:rPr>
+                <w:webHidden/>
+              </w:rPr>
+            </w:r>
+            <w:r>
+              <w:rPr>
+                <w:webHidden/>
+              </w:rPr>
+              <w:fldChar w:fldCharType="separate"/>
+            </w:r>
+            <w:r>
+              <w:rPr>
+                <w:webHidden/>
+              </w:rPr>
+              <w:t>5</w:t>
+            </w:r>
+            <w:r>
+              <w:rPr>
+                <w:webHidden/>
+              </w:rPr>
+              <w:fldChar w:fldCharType="end"/>
+            </w:r>
+          </w:hyperlink>
+        </w:p>
+        <w:p>
+          <w:pPr>
+            <w:pStyle w:val="Sisluet3"/>
+            <w:tabs>
+              <w:tab w:val="right" w:leader="dot" w:pos="9628"/>
+            </w:tabs>
+          </w:pPr>
+          <w:hyperlink w:anchor="_Toc229836492" w:history="1">
+            <w:r>
+              <w:rPr>
+                <w:rStyle w:val="Hyperlinkki"/>
+              </w:rPr>
+              <w:t>Security issues and vulnerabilities</w:t>
+            </w:r>
+            <w:r>
+              <w:rPr>
+                <w:webHidden/>
+              </w:rPr>
+              <w:tab/>
+            </w:r>
+            <w:r>
+              <w:rPr>
+                <w:webHidden/>
+              </w:rPr>
+              <w:fldChar w:fldCharType="begin"/>
+            </w:r>
+            <w:r>
+              <w:rPr>
+                <w:webHidden/>
+              </w:rPr>
+              <w:instrText xml:space="preserve"> PAGEREF _Toc229836492 \h </w:instrText>
+            </w:r>
+            <w:r>
+              <w:rPr>
+                <w:webHidden/>
+              </w:rPr>
+            </w:r>
+            <w:r>
+              <w:rPr>
+                <w:webHidden/>
+              </w:rPr>
+              <w:fldChar w:fldCharType="separate"/>
+            </w:r>
+            <w:r>
+              <w:rPr>
+                <w:webHidden/>
+              </w:rPr>
+              <w:t>5</w:t>
+            </w:r>
+            <w:r>
+              <w:rPr>
+                <w:webHidden/>
+              </w:rPr>
+              <w:fldChar w:fldCharType="end"/>
+            </w:r>
+          </w:hyperlink>
+        </w:p>
+        <w:p>
+          <w:pPr>
+            <w:pStyle w:val="Sisluet3"/>
+            <w:tabs>
+              <w:tab w:val="right" w:leader="dot" w:pos="9628"/>
+            </w:tabs>
+          </w:pPr>
+          <w:hyperlink w:anchor="_Toc229836493" w:history="1">
+            <w:r>
+              <w:rPr>
+                <w:rStyle w:val="Hyperlinkki"/>
+              </w:rPr>
+              <w:t>Use of AI</w:t>
+            </w:r>
+            <w:r>
+              <w:rPr>
+                <w:webHidden/>
+              </w:rPr>
+              <w:tab/>
+            </w:r>
+            <w:r>
+              <w:rPr>
+                <w:webHidden/>
+              </w:rPr>
+              <w:fldChar w:fldCharType="begin"/>
+            </w:r>
+            <w:r>
+              <w:rPr>
+                <w:webHidden/>
+              </w:rPr>
+              <w:instrText xml:space="preserve"> PAGEREF _Toc229836493 \h </w:instrText>
+            </w:r>
+            <w:r>
+              <w:rPr>
+                <w:webHidden/>
+              </w:rPr>
+            </w:r>
+            <w:r>
+              <w:rPr>
+                <w:webHidden/>
+              </w:rPr>
+              <w:fldChar w:fldCharType="separate"/>
+            </w:r>
+            <w:r>
+              <w:rPr>
+                <w:webHidden/>
+              </w:rPr>
+              <w:t>5</w:t>
+            </w:r>
+            <w:r>
+              <w:rPr>
+                <w:webHidden/>
+              </w:rPr>
+              <w:fldChar w:fldCharType="end"/>
+            </w:r>
+          </w:hyperlink>
+        </w:p>
+        <w:p>
+          <w:r>
+            <w:rPr>
+              <w:b/>
+              <w:bCs/>
+            </w:rPr>
+            <w:fldChar w:fldCharType="end"/>
+          </w:r>
         </w:p>
       </w:sdtContent>
     </w:sdt>
@@ -545,96 +1142,51 @@
         <w:pStyle w:val="Otsikko2"/>
         <w:ind w:left="720"/>
       </w:pPr>
+      <w:bookmarkStart w:id="0" w:name="_Toc229836484"/>
       <w:r>
         <w:lastRenderedPageBreak/>
-        <w:t xml:space="preserve">General </w:t>
-      </w:r>
-      <w:proofErr w:type="spellStart"/>
-      <w:r>
-        <w:t>Description</w:t>
-      </w:r>
-      <w:proofErr w:type="spellEnd"/>
-    </w:p>
-    <w:p>
-      <w:pPr>
-        <w:rPr>
-          <w:lang w:val="en-GB"/>
-        </w:rPr>
-      </w:pPr>
-      <w:r>
-        <w:rPr>
-          <w:lang w:val="en-GB"/>
-        </w:rPr>
-        <w:t xml:space="preserve">This program works as an </w:t>
-      </w:r>
-      <w:r>
-        <w:rPr>
-          <w:lang w:val="en-GB"/>
-        </w:rPr>
-        <w:t xml:space="preserve">offline CLI-based (Command Line Interface) password manager. </w:t>
+        <w:t>General Description</w:t>
+      </w:r>
+      <w:bookmarkEnd w:id="0"/>
+    </w:p>
+    <w:p>
+      <w:r>
+        <w:t xml:space="preserve">This program works as an offline CLI-based (Command Line Interface) password manager. </w:t>
       </w:r>
     </w:p>
     <w:p>
       <w:pPr>
         <w:pStyle w:val="Otsikko3"/>
-        <w:rPr>
-          <w:lang w:val="en-GB"/>
-        </w:rPr>
-      </w:pPr>
-      <w:r>
-        <w:rPr>
-          <w:lang w:val="en-GB"/>
-        </w:rPr>
+      </w:pPr>
+      <w:bookmarkStart w:id="1" w:name="_Toc229836485"/>
+      <w:r>
         <w:t>Installation</w:t>
       </w:r>
-    </w:p>
-    <w:p>
-      <w:pPr>
-        <w:rPr>
-          <w:lang w:val="en-GB"/>
-        </w:rPr>
-      </w:pPr>
-      <w:r>
-        <w:rPr>
-          <w:lang w:val="en-GB"/>
-        </w:rPr>
+      <w:bookmarkEnd w:id="1"/>
+    </w:p>
+    <w:p>
+      <w:r>
         <w:t xml:space="preserve">Program was </w:t>
       </w:r>
       <w:r>
-        <w:rPr>
-          <w:lang w:val="en-GB"/>
-        </w:rPr>
         <w:t>tested mainly</w:t>
       </w:r>
       <w:r>
-        <w:rPr>
-          <w:lang w:val="en-GB"/>
-        </w:rPr>
         <w:t xml:space="preserve"> on Windows using Command Prompt. Instructions are based on that as other platforms were not tested.</w:t>
       </w:r>
       <w:r>
-        <w:rPr>
-          <w:lang w:val="en-GB"/>
-        </w:rPr>
         <w:t xml:space="preserve"> </w:t>
       </w:r>
       <w:r>
-        <w:rPr>
-          <w:lang w:val="en-GB"/>
-        </w:rPr>
         <w:t xml:space="preserve">Most likely on other platforms .exe does not work and user needs to recompile the program for their interface. My compile command as reference: </w:t>
       </w:r>
       <w:r>
-        <w:rPr>
-          <w:lang w:val="en-GB"/>
-        </w:rPr>
         <w:br/>
       </w:r>
       <w:r>
         <w:rPr>
           <w:i/>
           <w:iCs/>
-          <w:lang w:val="en-GB"/>
         </w:rPr>
         <w:t>g++ -std=</w:t>
       </w:r>
@@ -643,7 +1195,6 @@
         <w:rPr>
           <w:i/>
           <w:iCs/>
-          <w:lang w:val="en-GB"/>
         </w:rPr>
         <w:t>c++</w:t>
       </w:r>
@@ -652,7 +1203,6 @@
         <w:rPr>
           <w:i/>
           <w:iCs/>
-          <w:lang w:val="en-GB"/>
         </w:rPr>
         <w:t>17 ^</w:t>
       </w:r>
@@ -660,7 +1210,6 @@
         <w:rPr>
           <w:i/>
           <w:iCs/>
-          <w:lang w:val="en-GB"/>
         </w:rPr>
         <w:br/>
       </w:r>
@@ -668,7 +1217,6 @@
         <w:rPr>
           <w:i/>
           <w:iCs/>
-          <w:lang w:val="en-GB"/>
         </w:rPr>
         <w:t>main.cpp ^</w:t>
       </w:r>
@@ -676,7 +1224,6 @@
         <w:rPr>
           <w:i/>
           <w:iCs/>
-          <w:lang w:val="en-GB"/>
         </w:rPr>
         <w:br/>
       </w:r>
@@ -684,7 +1231,6 @@
         <w:rPr>
           <w:i/>
           <w:iCs/>
-          <w:lang w:val="en-GB"/>
         </w:rPr>
         <w:t>crypto/crypto_manager.cpp ^</w:t>
       </w:r>
@@ -692,7 +1238,6 @@
         <w:rPr>
           <w:i/>
           <w:iCs/>
-          <w:lang w:val="en-GB"/>
         </w:rPr>
         <w:br/>
       </w:r>
@@ -700,7 +1245,6 @@
         <w:rPr>
           <w:i/>
           <w:iCs/>
-          <w:lang w:val="en-GB"/>
         </w:rPr>
         <w:t>storage/file_storage.cpp ^</w:t>
       </w:r>
@@ -708,7 +1252,6 @@
         <w:rPr>
           <w:i/>
           <w:iCs/>
-          <w:lang w:val="en-GB"/>
         </w:rPr>
         <w:br/>
       </w:r>
@@ -716,7 +1259,6 @@
         <w:rPr>
           <w:i/>
           <w:iCs/>
-          <w:lang w:val="en-GB"/>
         </w:rPr>
         <w:t>app/vault_manager.cpp ^</w:t>
       </w:r>
@@ -724,7 +1266,6 @@
         <w:rPr>
           <w:i/>
           <w:iCs/>
-          <w:lang w:val="en-GB"/>
         </w:rPr>
         <w:br/>
       </w:r>
@@ -732,7 +1273,6 @@
         <w:rPr>
           <w:i/>
           <w:iCs/>
-          <w:lang w:val="en-GB"/>
         </w:rPr>
         <w:t>-I. ^</w:t>
       </w:r>
@@ -740,7 +1280,6 @@
         <w:rPr>
           <w:i/>
           <w:iCs/>
-          <w:lang w:val="en-GB"/>
         </w:rPr>
         <w:br/>
       </w:r>
@@ -748,7 +1287,6 @@
         <w:rPr>
           <w:i/>
           <w:iCs/>
-          <w:lang w:val="en-GB"/>
         </w:rPr>
         <w:t>-LC:/msys64/mingw64/lib ^</w:t>
       </w:r>
@@ -756,7 +1294,6 @@
         <w:rPr>
           <w:i/>
           <w:iCs/>
-          <w:lang w:val="en-GB"/>
         </w:rPr>
         <w:br/>
       </w:r>
@@ -764,7 +1301,6 @@
         <w:rPr>
           <w:i/>
           <w:iCs/>
-          <w:lang w:val="en-GB"/>
         </w:rPr>
         <w:t>-</w:t>
       </w:r>
@@ -773,7 +1309,6 @@
         <w:rPr>
           <w:i/>
           <w:iCs/>
-          <w:lang w:val="en-GB"/>
         </w:rPr>
         <w:t>lsodium</w:t>
       </w:r>
@@ -782,7 +1317,6 @@
         <w:rPr>
           <w:i/>
           <w:iCs/>
-          <w:lang w:val="en-GB"/>
         </w:rPr>
         <w:t xml:space="preserve"> ^</w:t>
       </w:r>
@@ -790,7 +1324,6 @@
         <w:rPr>
           <w:i/>
           <w:iCs/>
-          <w:lang w:val="en-GB"/>
         </w:rPr>
         <w:br/>
       </w:r>
@@ -798,7 +1331,6 @@
         <w:rPr>
           <w:i/>
           <w:iCs/>
-          <w:lang w:val="en-GB"/>
         </w:rPr>
         <w:t>-o MyManager.exe</w:t>
       </w:r>
@@ -810,14 +1342,8 @@
           <w:ilvl w:val="0"/>
           <w:numId w:val="2"/>
         </w:numPr>
-        <w:rPr>
-          <w:lang w:val="en-GB"/>
-        </w:rPr>
-      </w:pPr>
-      <w:r>
-        <w:rPr>
-          <w:lang w:val="en-GB"/>
-        </w:rPr>
+      </w:pPr>
+      <w:r>
         <w:t>Start Command Prompt and create + navigate to the folder you wish to clone program into.</w:t>
       </w:r>
     </w:p>
@@ -828,21 +1354,14 @@
           <w:ilvl w:val="0"/>
           <w:numId w:val="2"/>
         </w:numPr>
-        <w:rPr>
-          <w:lang w:val="en-GB"/>
-        </w:rPr>
-      </w:pPr>
-      <w:r>
-        <w:rPr>
-          <w:lang w:val="en-GB"/>
-        </w:rPr>
+      </w:pPr>
+      <w:r>
         <w:t xml:space="preserve">git clone </w:t>
       </w:r>
       <w:hyperlink r:id="rId8" w:history="1">
         <w:r>
           <w:rPr>
             <w:rStyle w:val="Hyperlinkki"/>
-            <w:lang w:val="en-GB"/>
           </w:rPr>
           <w:t>https://github.com/tonihoooo/COMP.SEC.300.git</w:t>
         </w:r>
@@ -855,14 +1374,8 @@
           <w:ilvl w:val="0"/>
           <w:numId w:val="2"/>
         </w:numPr>
-        <w:rPr>
-          <w:lang w:val="en-GB"/>
-        </w:rPr>
-      </w:pPr>
-      <w:r>
-        <w:rPr>
-          <w:lang w:val="en-GB"/>
-        </w:rPr>
+      </w:pPr>
+      <w:r>
         <w:t>cd COMP.SEC.300</w:t>
       </w:r>
     </w:p>
@@ -873,68 +1386,34 @@
           <w:ilvl w:val="0"/>
           <w:numId w:val="2"/>
         </w:numPr>
-        <w:rPr>
-          <w:lang w:val="en-GB"/>
-        </w:rPr>
-      </w:pPr>
-      <w:r>
-        <w:rPr>
-          <w:lang w:val="en-GB"/>
-        </w:rPr>
+      </w:pPr>
+      <w:r>
         <w:t>Start program with &gt;MyManager.exe</w:t>
       </w:r>
     </w:p>
     <w:p>
       <w:pPr>
         <w:pStyle w:val="Otsikko3"/>
-        <w:rPr>
-          <w:lang w:val="en-GB"/>
-        </w:rPr>
-      </w:pPr>
-      <w:r>
-        <w:rPr>
-          <w:lang w:val="en-GB"/>
-        </w:rPr>
+      </w:pPr>
+      <w:bookmarkStart w:id="2" w:name="_Toc229836486"/>
+      <w:r>
         <w:t>Usage</w:t>
       </w:r>
-    </w:p>
-    <w:p>
-      <w:pPr>
-        <w:rPr>
-          <w:lang w:val="en-GB"/>
-        </w:rPr>
-      </w:pPr>
-      <w:r>
-        <w:rPr>
-          <w:lang w:val="en-GB"/>
-        </w:rPr>
+      <w:bookmarkEnd w:id="2"/>
+    </w:p>
+    <w:p>
+      <w:r>
         <w:t xml:space="preserve">Usage should be quite straightforward. Program asks for master password when started and on first use you set your master password. At the current state of the program this password </w:t>
       </w:r>
-      <w:proofErr w:type="gramStart"/>
-      <w:r>
-        <w:rPr>
-          <w:lang w:val="en-GB"/>
-        </w:rPr>
-        <w:t>has to</w:t>
-      </w:r>
-      <w:proofErr w:type="gramEnd"/>
-      <w:r>
-        <w:rPr>
-          <w:lang w:val="en-GB"/>
-        </w:rPr>
+      <w:r>
+        <w:t>must</w:t>
+      </w:r>
+      <w:r>
         <w:t xml:space="preserve"> be remembered as password vault is crypted based on this and there is no way to decrypt the vault if this password is lost or forgotten. vault.dat is created on program folder which should be deleted if the master password is lost or there is another reason to reset the vault. Once master password is entered user has four commands to choose from: add, list, delete and exit. </w:t>
       </w:r>
     </w:p>
     <w:p>
-      <w:pPr>
-        <w:rPr>
-          <w:lang w:val="en-GB"/>
-        </w:rPr>
-      </w:pPr>
-      <w:r>
-        <w:rPr>
-          <w:lang w:val="en-GB"/>
-        </w:rPr>
+      <w:r>
         <w:t>add – Add a new password to the vault</w:t>
       </w:r>
     </w:p>
@@ -945,14 +1424,8 @@
           <w:ilvl w:val="0"/>
           <w:numId w:val="8"/>
         </w:numPr>
-        <w:rPr>
-          <w:lang w:val="en-GB"/>
-        </w:rPr>
-      </w:pPr>
-      <w:r>
-        <w:rPr>
-          <w:lang w:val="en-GB"/>
-        </w:rPr>
+      </w:pPr>
+      <w:r>
         <w:t>Type “add”</w:t>
       </w:r>
     </w:p>
@@ -963,20 +1436,11 @@
           <w:ilvl w:val="0"/>
           <w:numId w:val="8"/>
         </w:numPr>
-        <w:rPr>
-          <w:lang w:val="en-GB"/>
-        </w:rPr>
-      </w:pPr>
-      <w:r>
-        <w:rPr>
-          <w:lang w:val="en-GB"/>
-        </w:rPr>
+      </w:pPr>
+      <w:r>
         <w:t xml:space="preserve">Type </w:t>
       </w:r>
       <w:r>
-        <w:rPr>
-          <w:lang w:val="en-GB"/>
-        </w:rPr>
         <w:t>&lt;entry name&gt;</w:t>
       </w:r>
     </w:p>
@@ -987,20 +1451,11 @@
           <w:ilvl w:val="0"/>
           <w:numId w:val="8"/>
         </w:numPr>
-        <w:rPr>
-          <w:lang w:val="en-GB"/>
-        </w:rPr>
-      </w:pPr>
-      <w:r>
-        <w:rPr>
-          <w:lang w:val="en-GB"/>
-        </w:rPr>
+      </w:pPr>
+      <w:r>
         <w:t xml:space="preserve">Type </w:t>
       </w:r>
       <w:r>
-        <w:rPr>
-          <w:lang w:val="en-GB"/>
-        </w:rPr>
         <w:t>&lt;username&gt;</w:t>
       </w:r>
     </w:p>
@@ -1011,14 +1466,8 @@
           <w:ilvl w:val="0"/>
           <w:numId w:val="8"/>
         </w:numPr>
-        <w:rPr>
-          <w:lang w:val="en-GB"/>
-        </w:rPr>
-      </w:pPr>
-      <w:r>
-        <w:rPr>
-          <w:lang w:val="en-GB"/>
-        </w:rPr>
+      </w:pPr>
+      <w:r>
         <w:t>type &lt;password&gt;</w:t>
       </w:r>
     </w:p>
@@ -1029,40 +1478,18 @@
           <w:ilvl w:val="0"/>
           <w:numId w:val="8"/>
         </w:numPr>
-        <w:rPr>
-          <w:lang w:val="en-GB"/>
-        </w:rPr>
-      </w:pPr>
-      <w:r>
-        <w:rPr>
-          <w:lang w:val="en-GB"/>
-        </w:rPr>
+      </w:pPr>
+      <w:r>
         <w:t>Entry saved.</w:t>
       </w:r>
     </w:p>
     <w:p>
-      <w:pPr>
-        <w:rPr>
-          <w:lang w:val="en-GB"/>
-        </w:rPr>
-      </w:pPr>
-      <w:r>
-        <w:rPr>
-          <w:lang w:val="en-GB"/>
-        </w:rPr>
+      <w:r>
         <w:t>list – List all the passwords currently stored in the vault</w:t>
       </w:r>
     </w:p>
     <w:p>
-      <w:pPr>
-        <w:rPr>
-          <w:lang w:val="en-GB"/>
-        </w:rPr>
-      </w:pPr>
-      <w:r>
-        <w:rPr>
-          <w:lang w:val="en-GB"/>
-        </w:rPr>
+      <w:r>
         <w:t>delete – Delete a password from the vault</w:t>
       </w:r>
     </w:p>
@@ -1073,14 +1500,8 @@
           <w:ilvl w:val="0"/>
           <w:numId w:val="9"/>
         </w:numPr>
-        <w:rPr>
-          <w:lang w:val="en-GB"/>
-        </w:rPr>
-      </w:pPr>
-      <w:r>
-        <w:rPr>
-          <w:lang w:val="en-GB"/>
-        </w:rPr>
+      </w:pPr>
+      <w:r>
         <w:lastRenderedPageBreak/>
         <w:t>Type “delete”</w:t>
       </w:r>
@@ -1092,14 +1513,8 @@
           <w:ilvl w:val="0"/>
           <w:numId w:val="9"/>
         </w:numPr>
-        <w:rPr>
-          <w:lang w:val="en-GB"/>
-        </w:rPr>
-      </w:pPr>
-      <w:r>
-        <w:rPr>
-          <w:lang w:val="en-GB"/>
-        </w:rPr>
+      </w:pPr>
+      <w:r>
         <w:t>type &lt;entry name&gt;</w:t>
       </w:r>
     </w:p>
@@ -1110,816 +1525,707 @@
           <w:ilvl w:val="0"/>
           <w:numId w:val="9"/>
         </w:numPr>
-        <w:rPr>
-          <w:lang w:val="en-GB"/>
-        </w:rPr>
-      </w:pPr>
-      <w:r>
-        <w:rPr>
-          <w:lang w:val="en-GB"/>
-        </w:rPr>
+      </w:pPr>
+      <w:r>
         <w:t>Entry deleted</w:t>
       </w:r>
     </w:p>
     <w:p>
-      <w:pPr>
-        <w:rPr>
-          <w:lang w:val="en-GB"/>
-        </w:rPr>
-      </w:pPr>
-      <w:r>
-        <w:rPr>
-          <w:lang w:val="en-GB"/>
-        </w:rPr>
+      <w:r>
         <w:t>exit – Exit the vault and terminate the program</w:t>
       </w:r>
     </w:p>
     <w:p>
-      <w:pPr>
-        <w:rPr>
-          <w:lang w:val="en-GB"/>
-        </w:rPr>
-      </w:pPr>
-      <w:r>
-        <w:rPr>
-          <w:lang w:val="en-GB"/>
-        </w:rPr>
+      <w:r>
         <w:t>Program is restarted with starting the .exe and typing the same master password.</w:t>
       </w:r>
     </w:p>
     <w:p>
       <w:pPr>
         <w:pStyle w:val="Otsikko2"/>
-        <w:rPr>
-          <w:lang w:val="en-GB"/>
-        </w:rPr>
-      </w:pPr>
-      <w:r>
-        <w:rPr>
-          <w:lang w:val="en-GB"/>
-        </w:rPr>
+      </w:pPr>
+      <w:bookmarkStart w:id="3" w:name="_Toc229836487"/>
+      <w:r>
         <w:t xml:space="preserve">Structure of the </w:t>
       </w:r>
       <w:r>
-        <w:rPr>
-          <w:lang w:val="en-GB"/>
-        </w:rPr>
         <w:t>P</w:t>
       </w:r>
       <w:r>
-        <w:rPr>
-          <w:lang w:val="en-GB"/>
-        </w:rPr>
         <w:t>rogram</w:t>
       </w:r>
-    </w:p>
-    <w:p>
-      <w:pPr>
-        <w:rPr>
-          <w:lang w:val="en-GB"/>
-        </w:rPr>
-      </w:pPr>
-      <w:r>
-        <w:rPr>
-          <w:lang w:val="en-GB"/>
-        </w:rPr>
+      <w:bookmarkEnd w:id="3"/>
+    </w:p>
+    <w:p>
+      <w:r>
         <w:t xml:space="preserve">Main program logic is handled in app/, crypto/ and storage/. Program uses catch2 for testing and </w:t>
       </w:r>
       <w:proofErr w:type="spellStart"/>
       <w:r>
-        <w:rPr>
-          <w:lang w:val="en-GB"/>
-        </w:rPr>
         <w:t>Libsodium</w:t>
       </w:r>
       <w:proofErr w:type="spellEnd"/>
       <w:r>
-        <w:rPr>
-          <w:lang w:val="en-GB"/>
-        </w:rPr>
         <w:t xml:space="preserve"> for encryption/decryption.</w:t>
       </w:r>
     </w:p>
     <w:p>
-      <w:pPr>
-        <w:rPr>
-          <w:lang w:val="en-GB"/>
-        </w:rPr>
-      </w:pPr>
-      <w:r>
-        <w:rPr>
-          <w:lang w:val="en-GB"/>
-        </w:rPr>
+      <w:r>
         <w:t>main.cpp interacts with the following folders: app</w:t>
       </w:r>
       <w:r>
-        <w:rPr>
-          <w:lang w:val="en-GB"/>
-        </w:rPr>
         <w:t>/</w:t>
       </w:r>
       <w:r>
-        <w:rPr>
-          <w:lang w:val="en-GB"/>
-        </w:rPr>
         <w:t>, crypto</w:t>
       </w:r>
       <w:r>
-        <w:rPr>
-          <w:lang w:val="en-GB"/>
-        </w:rPr>
         <w:t>/</w:t>
       </w:r>
       <w:r>
-        <w:rPr>
-          <w:lang w:val="en-GB"/>
-        </w:rPr>
         <w:t xml:space="preserve"> and storage</w:t>
       </w:r>
       <w:r>
-        <w:rPr>
-          <w:lang w:val="en-GB"/>
-        </w:rPr>
         <w:t>/</w:t>
       </w:r>
       <w:r>
-        <w:rPr>
-          <w:lang w:val="en-GB"/>
-        </w:rPr>
         <w:t xml:space="preserve">. App encloses vault_manager.cpp which is responsible for </w:t>
       </w:r>
       <w:r>
-        <w:rPr>
-          <w:lang w:val="en-GB"/>
-        </w:rPr>
         <w:t>main application logic. Crypto encloses cryptographic operations. Storage encloses file interaction.</w:t>
       </w:r>
     </w:p>
     <w:p>
-      <w:pPr>
-        <w:rPr>
-          <w:lang w:val="en-GB"/>
-        </w:rPr>
-      </w:pPr>
-      <w:r>
-        <w:rPr>
-          <w:lang w:val="en-GB"/>
-        </w:rPr>
+      <w:r>
         <w:t xml:space="preserve">CMakeLists.txt tells </w:t>
       </w:r>
       <w:r>
-        <w:rPr>
-          <w:lang w:val="en-GB"/>
-        </w:rPr>
         <w:t>GitHub</w:t>
       </w:r>
       <w:r>
-        <w:rPr>
-          <w:lang w:val="en-GB"/>
-        </w:rPr>
         <w:t xml:space="preserve"> Actions how to build the program. </w:t>
       </w:r>
       <w:proofErr w:type="spellStart"/>
       <w:r>
-        <w:rPr>
-          <w:lang w:val="en-GB"/>
-        </w:rPr>
         <w:t>github</w:t>
       </w:r>
       <w:proofErr w:type="spellEnd"/>
       <w:r>
-        <w:rPr>
-          <w:lang w:val="en-GB"/>
-        </w:rPr>
         <w:t xml:space="preserve">/workflows encloses </w:t>
       </w:r>
       <w:proofErr w:type="spellStart"/>
       <w:r>
-        <w:rPr>
-          <w:lang w:val="en-GB"/>
-        </w:rPr>
         <w:t>ci.yml</w:t>
       </w:r>
       <w:proofErr w:type="spellEnd"/>
       <w:r>
-        <w:rPr>
-          <w:lang w:val="en-GB"/>
-        </w:rPr>
         <w:t xml:space="preserve"> which has instructions for CI/CD pipeline. sonar-</w:t>
       </w:r>
       <w:proofErr w:type="spellStart"/>
       <w:proofErr w:type="gramStart"/>
       <w:r>
-        <w:rPr>
-          <w:lang w:val="en-GB"/>
-        </w:rPr>
         <w:t>project.properties</w:t>
       </w:r>
       <w:proofErr w:type="spellEnd"/>
       <w:proofErr w:type="gramEnd"/>
       <w:r>
-        <w:rPr>
-          <w:lang w:val="en-GB"/>
-        </w:rPr>
         <w:t xml:space="preserve"> has instructions for </w:t>
       </w:r>
       <w:proofErr w:type="spellStart"/>
       <w:r>
-        <w:rPr>
-          <w:lang w:val="en-GB"/>
-        </w:rPr>
         <w:t>SonarCloud</w:t>
       </w:r>
       <w:proofErr w:type="spellEnd"/>
       <w:r>
-        <w:rPr>
-          <w:lang w:val="en-GB"/>
-        </w:rPr>
         <w:t>.</w:t>
       </w:r>
     </w:p>
     <w:p>
-      <w:pPr>
-        <w:rPr>
-          <w:lang w:val="en-GB"/>
-        </w:rPr>
-      </w:pPr>
       <w:proofErr w:type="gramStart"/>
       <w:r>
-        <w:rPr>
-          <w:lang w:val="en-GB"/>
-        </w:rPr>
         <w:t>./</w:t>
       </w:r>
       <w:proofErr w:type="gramEnd"/>
       <w:r>
-        <w:rPr>
-          <w:lang w:val="en-GB"/>
-        </w:rPr>
         <w:t xml:space="preserve">tests </w:t>
       </w:r>
       <w:proofErr w:type="gramStart"/>
       <w:r>
-        <w:rPr>
-          <w:lang w:val="en-GB"/>
-        </w:rPr>
         <w:t>has</w:t>
       </w:r>
       <w:proofErr w:type="gramEnd"/>
       <w:r>
-        <w:rPr>
-          <w:lang w:val="en-GB"/>
-        </w:rPr>
         <w:t xml:space="preserve"> all the tests for the program. </w:t>
       </w:r>
     </w:p>
     <w:p>
       <w:pPr>
         <w:pStyle w:val="Otsikko2"/>
-        <w:rPr>
-          <w:lang w:val="en-GB"/>
-        </w:rPr>
-      </w:pPr>
-      <w:r>
-        <w:rPr>
-          <w:lang w:val="en-GB"/>
-        </w:rPr>
+      </w:pPr>
+      <w:bookmarkStart w:id="4" w:name="_Toc229836488"/>
+      <w:r>
         <w:t>Secure Programming Solutions</w:t>
       </w:r>
-    </w:p>
-    <w:p>
-      <w:pPr>
-        <w:rPr>
-          <w:lang w:val="en-GB"/>
-        </w:rPr>
-      </w:pPr>
-      <w:r>
-        <w:rPr>
-          <w:lang w:val="en-GB"/>
-        </w:rPr>
+      <w:bookmarkEnd w:id="4"/>
+    </w:p>
+    <w:p>
+      <w:r>
         <w:t xml:space="preserve">The cryptographic choice of the program was </w:t>
       </w:r>
       <w:proofErr w:type="spellStart"/>
       <w:r>
-        <w:rPr>
-          <w:lang w:val="en-GB"/>
-        </w:rPr>
         <w:t>Libsodium</w:t>
       </w:r>
       <w:proofErr w:type="spellEnd"/>
       <w:r>
-        <w:rPr>
-          <w:lang w:val="en-GB"/>
-        </w:rPr>
         <w:t xml:space="preserve"> instead of manual custom crypto</w:t>
       </w:r>
       <w:r>
-        <w:rPr>
-          <w:lang w:val="en-GB"/>
-        </w:rPr>
         <w:t xml:space="preserve">. </w:t>
       </w:r>
       <w:proofErr w:type="spellStart"/>
       <w:r>
-        <w:rPr>
-          <w:lang w:val="en-GB"/>
-        </w:rPr>
         <w:t>Libsodium</w:t>
       </w:r>
       <w:proofErr w:type="spellEnd"/>
       <w:r>
-        <w:rPr>
-          <w:lang w:val="en-GB"/>
-        </w:rPr>
         <w:t xml:space="preserve"> was found to be modern, well-tested and secure external library. It is used on encrypting the passwords before the data is written to the disk. </w:t>
       </w:r>
     </w:p>
     <w:p>
-      <w:pPr>
-        <w:rPr>
-          <w:lang w:val="en-GB"/>
-        </w:rPr>
-      </w:pPr>
-      <w:r>
-        <w:rPr>
-          <w:lang w:val="en-GB"/>
-        </w:rPr>
+      <w:r>
         <w:t xml:space="preserve">Program is clearly divided into different responsibility areas; app/, crypto/ and storage/. This way security-critical code is separated properly and maintainability is </w:t>
       </w:r>
       <w:r>
-        <w:rPr>
-          <w:lang w:val="en-GB"/>
-        </w:rPr>
         <w:t xml:space="preserve">easier. </w:t>
       </w:r>
     </w:p>
     <w:p>
-      <w:pPr>
-        <w:rPr>
-          <w:lang w:val="en-GB"/>
-        </w:rPr>
-      </w:pPr>
-      <w:r>
-        <w:rPr>
-          <w:lang w:val="en-GB"/>
-        </w:rPr>
+      <w:r>
         <w:t xml:space="preserve">Static application security testing SAST is implemented through </w:t>
       </w:r>
       <w:r>
-        <w:rPr>
-          <w:lang w:val="en-GB"/>
-        </w:rPr>
         <w:t>GitHub</w:t>
       </w:r>
       <w:r>
-        <w:rPr>
-          <w:lang w:val="en-GB"/>
-        </w:rPr>
         <w:t xml:space="preserve"> Actions CI/CD pipelines and </w:t>
       </w:r>
       <w:proofErr w:type="spellStart"/>
       <w:r>
-        <w:rPr>
-          <w:lang w:val="en-GB"/>
-        </w:rPr>
         <w:t>SonarCloud</w:t>
       </w:r>
       <w:proofErr w:type="spellEnd"/>
       <w:r>
-        <w:rPr>
-          <w:lang w:val="en-GB"/>
-        </w:rPr>
         <w:t>. CI executes it automatically on every update.</w:t>
       </w:r>
     </w:p>
     <w:p>
-      <w:pPr>
-        <w:rPr>
-          <w:lang w:val="en-GB"/>
-        </w:rPr>
-      </w:pPr>
-      <w:r>
-        <w:rPr>
-          <w:lang w:val="en-GB"/>
-        </w:rPr>
+      <w:r>
         <w:t xml:space="preserve">Automated testing is done using Catch2. CI executes tests automatically through </w:t>
       </w:r>
       <w:r>
-        <w:rPr>
-          <w:lang w:val="en-GB"/>
-        </w:rPr>
         <w:t>GitHub</w:t>
       </w:r>
       <w:r>
-        <w:rPr>
-          <w:lang w:val="en-GB"/>
-        </w:rPr>
         <w:t xml:space="preserve"> Actions.</w:t>
       </w:r>
     </w:p>
     <w:p>
-      <w:pPr>
-        <w:rPr>
-          <w:lang w:val="en-GB"/>
-        </w:rPr>
-      </w:pPr>
-      <w:r>
-        <w:rPr>
-          <w:lang w:val="en-GB"/>
-        </w:rPr>
+      <w:r>
         <w:t>In the</w:t>
       </w:r>
       <w:r>
-        <w:rPr>
-          <w:lang w:val="en-GB"/>
-        </w:rPr>
         <w:t xml:space="preserve"> code particular attention was paid </w:t>
       </w:r>
       <w:r>
-        <w:rPr>
-          <w:lang w:val="en-GB"/>
-        </w:rPr>
         <w:t>not to</w:t>
       </w:r>
       <w:r>
-        <w:rPr>
-          <w:lang w:val="en-GB"/>
-        </w:rPr>
         <w:t xml:space="preserve"> hardcode any secrets to the code. Sensitive data is encrypted/decrypted dynamically during runtime. </w:t>
       </w:r>
       <w:r>
-        <w:rPr>
-          <w:lang w:val="en-GB"/>
-        </w:rPr>
         <w:t>Password storage is hashed using nonce and random salt. Plaintext exposure in memory was minimized and program includes exception handling. Proper memory handling was kept in mind during programming.</w:t>
       </w:r>
     </w:p>
     <w:p>
       <w:pPr>
         <w:pStyle w:val="Otsikko3"/>
-        <w:rPr>
-          <w:lang w:val="en-GB"/>
-        </w:rPr>
-      </w:pPr>
-      <w:r>
-        <w:rPr>
-          <w:lang w:val="en-GB"/>
-        </w:rPr>
+      </w:pPr>
+      <w:bookmarkStart w:id="5" w:name="_Toc229836489"/>
+      <w:r>
         <w:t>OWASP TOP 10</w:t>
       </w:r>
-    </w:p>
-    <w:p>
-      <w:pPr>
-        <w:rPr>
-          <w:lang w:val="en-GB"/>
-        </w:rPr>
-      </w:pPr>
-      <w:r>
-        <w:rPr>
-          <w:lang w:val="en-GB"/>
-        </w:rPr>
+      <w:bookmarkEnd w:id="5"/>
+    </w:p>
+    <w:p>
+      <w:r>
         <w:t>A01: Broken Access Control</w:t>
       </w:r>
       <w:r>
-        <w:rPr>
-          <w:lang w:val="en-GB"/>
-        </w:rPr>
         <w:br/>
         <w:t>As program is local single-user CLI app this part is not applicable. Master password exists to protect vault access.</w:t>
       </w:r>
       <w:r>
-        <w:rPr>
-          <w:lang w:val="en-GB"/>
-        </w:rPr>
         <w:t xml:space="preserve"> Mostly not applicable.</w:t>
       </w:r>
     </w:p>
     <w:p>
-      <w:pPr>
-        <w:rPr>
-          <w:lang w:val="en-GB"/>
-        </w:rPr>
-      </w:pPr>
-      <w:r>
-        <w:rPr>
-          <w:lang w:val="en-GB"/>
-        </w:rPr>
+      <w:r>
         <w:lastRenderedPageBreak/>
         <w:t>A02: Security Misconfiguration</w:t>
       </w:r>
       <w:r>
-        <w:rPr>
-          <w:lang w:val="en-GB"/>
-        </w:rPr>
         <w:br/>
         <w:t xml:space="preserve">CI/CD and </w:t>
       </w:r>
       <w:proofErr w:type="spellStart"/>
       <w:r>
-        <w:rPr>
-          <w:lang w:val="en-GB"/>
-        </w:rPr>
         <w:t>SonarCloud</w:t>
       </w:r>
       <w:proofErr w:type="spellEnd"/>
       <w:r>
-        <w:rPr>
-          <w:lang w:val="en-GB"/>
-        </w:rPr>
         <w:t xml:space="preserve"> used. </w:t>
       </w:r>
     </w:p>
     <w:p>
-      <w:pPr>
-        <w:rPr>
-          <w:lang w:val="en-GB"/>
-        </w:rPr>
-      </w:pPr>
-      <w:r>
-        <w:rPr>
-          <w:lang w:val="en-GB"/>
-        </w:rPr>
+      <w:r>
         <w:t>A03: Software Supply Chain Failures</w:t>
       </w:r>
       <w:r>
-        <w:rPr>
-          <w:lang w:val="en-GB"/>
-        </w:rPr>
         <w:br/>
         <w:t xml:space="preserve">Dependencies installed through </w:t>
       </w:r>
       <w:proofErr w:type="spellStart"/>
       <w:r>
-        <w:rPr>
-          <w:lang w:val="en-GB"/>
-        </w:rPr>
         <w:t>vckpg</w:t>
       </w:r>
       <w:proofErr w:type="spellEnd"/>
       <w:r>
-        <w:rPr>
-          <w:lang w:val="en-GB"/>
-        </w:rPr>
         <w:t xml:space="preserve"> in GitHub Actions. CI builds from a clean environment. </w:t>
       </w:r>
       <w:proofErr w:type="spellStart"/>
       <w:r>
-        <w:rPr>
-          <w:lang w:val="en-GB"/>
-        </w:rPr>
         <w:t>SonarCloud</w:t>
       </w:r>
       <w:proofErr w:type="spellEnd"/>
       <w:r>
-        <w:rPr>
-          <w:lang w:val="en-GB"/>
-        </w:rPr>
         <w:t xml:space="preserve"> used for static analysis. Build artifacts/dependencies mostly </w:t>
       </w:r>
       <w:proofErr w:type="spellStart"/>
       <w:r>
-        <w:rPr>
-          <w:lang w:val="en-GB"/>
-        </w:rPr>
         <w:t>excluses</w:t>
       </w:r>
       <w:proofErr w:type="spellEnd"/>
       <w:r>
-        <w:rPr>
-          <w:lang w:val="en-GB"/>
-        </w:rPr>
         <w:t xml:space="preserve"> </w:t>
       </w:r>
       <w:proofErr w:type="gramStart"/>
       <w:r>
-        <w:rPr>
-          <w:lang w:val="en-GB"/>
-        </w:rPr>
         <w:t>using .</w:t>
       </w:r>
       <w:proofErr w:type="spellStart"/>
       <w:r>
-        <w:rPr>
-          <w:lang w:val="en-GB"/>
-        </w:rPr>
         <w:t>gitignore</w:t>
       </w:r>
       <w:proofErr w:type="spellEnd"/>
       <w:proofErr w:type="gramEnd"/>
       <w:r>
-        <w:rPr>
-          <w:lang w:val="en-GB"/>
-        </w:rPr>
         <w:t>.</w:t>
       </w:r>
     </w:p>
     <w:p>
-      <w:pPr>
-        <w:rPr>
-          <w:lang w:val="en-GB"/>
-        </w:rPr>
-      </w:pPr>
-      <w:r>
-        <w:rPr>
-          <w:lang w:val="en-GB"/>
-        </w:rPr>
+      <w:r>
         <w:t>A04: Cryptographic Failures</w:t>
       </w:r>
       <w:r>
-        <w:rPr>
-          <w:lang w:val="en-GB"/>
-        </w:rPr>
         <w:br/>
       </w:r>
       <w:r>
-        <w:rPr>
-          <w:lang w:val="en-GB"/>
-        </w:rPr>
         <w:t xml:space="preserve">Manual crypto replaced with </w:t>
       </w:r>
       <w:proofErr w:type="spellStart"/>
       <w:r>
-        <w:rPr>
-          <w:lang w:val="en-GB"/>
-        </w:rPr>
         <w:t>Libsodium</w:t>
       </w:r>
       <w:proofErr w:type="spellEnd"/>
       <w:r>
-        <w:rPr>
-          <w:lang w:val="en-GB"/>
-        </w:rPr>
         <w:t>. Random salt, random nonce and authenticated encryption, decryption included.</w:t>
       </w:r>
     </w:p>
     <w:p>
-      <w:pPr>
-        <w:rPr>
-          <w:lang w:val="en-GB"/>
-        </w:rPr>
-      </w:pPr>
-      <w:r>
-        <w:rPr>
-          <w:lang w:val="en-GB"/>
-        </w:rPr>
+      <w:r>
         <w:t>A05: Injection</w:t>
       </w:r>
       <w:r>
-        <w:rPr>
-          <w:lang w:val="en-GB"/>
-        </w:rPr>
         <w:br/>
         <w:t>No SQL, no web input, no database. Mostly not applicable.</w:t>
       </w:r>
     </w:p>
     <w:p>
-      <w:pPr>
-        <w:rPr>
-          <w:lang w:val="en-GB"/>
-        </w:rPr>
-      </w:pPr>
-      <w:r>
-        <w:rPr>
-          <w:lang w:val="en-GB"/>
-        </w:rPr>
+      <w:r>
         <w:t>A06: Insecure Design</w:t>
       </w:r>
       <w:r>
-        <w:rPr>
-          <w:lang w:val="en-GB"/>
-        </w:rPr>
         <w:br/>
         <w:t>Layered design using app/, crypto/ and storage/.</w:t>
       </w:r>
     </w:p>
     <w:p>
-      <w:pPr>
-        <w:rPr>
-          <w:lang w:val="en-GB"/>
-        </w:rPr>
-      </w:pPr>
-      <w:r>
-        <w:rPr>
-          <w:lang w:val="en-GB"/>
-        </w:rPr>
+      <w:r>
         <w:t>A07: Authentication Failures</w:t>
       </w:r>
       <w:r>
-        <w:rPr>
-          <w:lang w:val="en-GB"/>
-        </w:rPr>
         <w:br/>
         <w:t>Master password is used and using wrong one fails safely. However, if master password is lost all data is lost.</w:t>
       </w:r>
     </w:p>
     <w:p>
-      <w:pPr>
-        <w:rPr>
-          <w:lang w:val="en-GB"/>
-        </w:rPr>
-      </w:pPr>
-      <w:r>
-        <w:rPr>
-          <w:lang w:val="en-GB"/>
-        </w:rPr>
+      <w:r>
         <w:t>A08: Software or Data Integrity Failures</w:t>
       </w:r>
       <w:r>
-        <w:rPr>
-          <w:lang w:val="en-GB"/>
-        </w:rPr>
         <w:br/>
         <w:t xml:space="preserve">Vault format has magic/version header. GitHub Actions builds and tests project. </w:t>
       </w:r>
       <w:proofErr w:type="spellStart"/>
       <w:r>
-        <w:rPr>
-          <w:lang w:val="en-GB"/>
-        </w:rPr>
         <w:t>SonarCloud</w:t>
       </w:r>
       <w:proofErr w:type="spellEnd"/>
       <w:r>
-        <w:rPr>
-          <w:lang w:val="en-GB"/>
-        </w:rPr>
         <w:t xml:space="preserve"> and SAST used. However, all data is lost if vault file gets corrupted.</w:t>
       </w:r>
     </w:p>
     <w:p>
-      <w:pPr>
-        <w:rPr>
-          <w:lang w:val="en-GB"/>
-        </w:rPr>
-      </w:pPr>
-      <w:r>
-        <w:rPr>
-          <w:lang w:val="en-GB"/>
-        </w:rPr>
+      <w:r>
         <w:t>A09: Security Logging and Alerting Failures</w:t>
       </w:r>
       <w:r>
-        <w:rPr>
-          <w:lang w:val="en-GB"/>
-        </w:rPr>
         <w:br/>
         <w:t xml:space="preserve">CLI has simple messages only. No proper logging exists </w:t>
       </w:r>
       <w:proofErr w:type="spellStart"/>
       <w:r>
-        <w:rPr>
-          <w:lang w:val="en-GB"/>
-        </w:rPr>
         <w:t>atm</w:t>
       </w:r>
       <w:proofErr w:type="spellEnd"/>
       <w:r>
-        <w:rPr>
-          <w:lang w:val="en-GB"/>
-        </w:rPr>
         <w:t xml:space="preserve"> which on the other hand avoids exposing secrets.</w:t>
       </w:r>
     </w:p>
     <w:p>
-      <w:pPr>
-        <w:rPr>
-          <w:lang w:val="en-GB"/>
-        </w:rPr>
-      </w:pPr>
-      <w:r>
-        <w:rPr>
-          <w:lang w:val="en-GB"/>
-        </w:rPr>
+      <w:r>
         <w:t>A10: Mishandling of Exceptional Conditions</w:t>
       </w:r>
       <w:r>
-        <w:rPr>
-          <w:lang w:val="en-GB"/>
-        </w:rPr>
         <w:br/>
         <w:t xml:space="preserve">Wrong master password handling. </w:t>
       </w:r>
       <w:proofErr w:type="spellStart"/>
       <w:r>
-        <w:rPr>
-          <w:lang w:val="en-GB"/>
-        </w:rPr>
         <w:t>Libsodium</w:t>
       </w:r>
       <w:proofErr w:type="spellEnd"/>
       <w:r>
-        <w:rPr>
-          <w:lang w:val="en-GB"/>
-        </w:rPr>
         <w:t xml:space="preserve"> authentication failure handling. Loading corrupted vault handled. CLI shows some messages when exceptions arise. </w:t>
       </w:r>
     </w:p>
     <w:p>
       <w:pPr>
+        <w:pStyle w:val="Otsikko2"/>
+      </w:pPr>
+      <w:bookmarkStart w:id="6" w:name="_Toc229836490"/>
+      <w:r>
+        <w:t>Testing</w:t>
+      </w:r>
+      <w:bookmarkEnd w:id="6"/>
+    </w:p>
+    <w:p>
+      <w:r>
+        <w:t xml:space="preserve">Testing was done both manually and automatically. For automated tests Catch2 was used. Latest release of Catch2 was not used due to integration difficulties. The version of Catch2 currently in use is header-only which was relatively fast to implement. This is of course security issue which should be fixed but as there was not enough time for me to properly configure the latest version. </w:t>
+      </w:r>
+      <w:proofErr w:type="spellStart"/>
+      <w:r>
+        <w:t>SonarCloud</w:t>
+      </w:r>
+      <w:proofErr w:type="spellEnd"/>
+      <w:r>
+        <w:t xml:space="preserve"> is used for SAST.</w:t>
+      </w:r>
+    </w:p>
+    <w:p>
+      <w:r>
+        <w:t xml:space="preserve">Automated tests ran with Catch2 we’re all successful. Latest successful run with </w:t>
+      </w:r>
+      <w:proofErr w:type="spellStart"/>
+      <w:r>
+        <w:t>SonarCloud</w:t>
+      </w:r>
+      <w:proofErr w:type="spellEnd"/>
+      <w:r>
+        <w:t xml:space="preserve"> included 19 medium issues and 2 low </w:t>
+      </w:r>
+      <w:r>
+        <w:t>issues</w:t>
+      </w:r>
+      <w:r>
+        <w:t xml:space="preserve"> in the code. </w:t>
+      </w:r>
+    </w:p>
+    <w:p>
+      <w:pPr>
+        <w:pStyle w:val="Otsikko2"/>
+      </w:pPr>
+      <w:bookmarkStart w:id="7" w:name="_Toc229836491"/>
+      <w:r>
+        <w:lastRenderedPageBreak/>
+        <w:t>Future implementations</w:t>
+      </w:r>
+      <w:bookmarkEnd w:id="7"/>
+    </w:p>
+    <w:p>
+      <w:r>
+        <w:t xml:space="preserve">Some future implementations for code would include adding MFA and prompting user to use secure master password. Current implementation has no requirements for master password. This prompting should be expanded for regular passwords as well. </w:t>
+      </w:r>
+      <w:r>
+        <w:t>User</w:t>
+      </w:r>
+      <w:r>
+        <w:t xml:space="preserve"> input would require </w:t>
+      </w:r>
+      <w:r>
+        <w:t>some</w:t>
+      </w:r>
+      <w:r>
+        <w:t xml:space="preserve"> fine-tuning as currently using spaces with commands like “add test </w:t>
+      </w:r>
+      <w:proofErr w:type="spellStart"/>
+      <w:r>
+        <w:t>test</w:t>
+      </w:r>
+      <w:proofErr w:type="spellEnd"/>
+      <w:r>
+        <w:t xml:space="preserve"> </w:t>
+      </w:r>
+      <w:proofErr w:type="spellStart"/>
+      <w:r>
+        <w:t>test</w:t>
+      </w:r>
+      <w:proofErr w:type="spellEnd"/>
+      <w:r>
+        <w:t xml:space="preserve">” successfully adds new password as single-line input but it makes the UI look weird. This is not user-friendly and is </w:t>
+      </w:r>
+      <w:r>
+        <w:t>quite</w:t>
+      </w:r>
+      <w:r>
+        <w:t xml:space="preserve"> fast to fix but as UX was not on primary focus on this course I decided to use my time to battle security and testing issues instead.</w:t>
+      </w:r>
+    </w:p>
+    <w:p>
+      <w:r>
+        <w:t>Project would require more thorough exception handling and more automated tests.</w:t>
+      </w:r>
+      <w:r>
+        <w:t xml:space="preserve"> Catch2 should be updated to the latest version.</w:t>
+      </w:r>
+      <w:r>
+        <w:t xml:space="preserve"> </w:t>
+      </w:r>
+      <w:proofErr w:type="spellStart"/>
+      <w:r>
+        <w:t>SonarCloud</w:t>
+      </w:r>
+      <w:proofErr w:type="spellEnd"/>
+      <w:r>
+        <w:t xml:space="preserve"> implementation does not function as it should. On the latest working version files in app/, crypto/ and storage/ we’re tested but main.cpp and tests/ we’re not as including tests/ caused errors which I could not fix in the given time window.</w:t>
+      </w:r>
+      <w:r>
+        <w:t xml:space="preserve"> CI/CD pipeline only has partly functioning SAST test now. I wanted to add at least SCA and</w:t>
+      </w:r>
+      <w:r>
+        <w:t xml:space="preserve"> automatic</w:t>
+      </w:r>
+      <w:r>
+        <w:t xml:space="preserve"> </w:t>
+      </w:r>
+      <w:proofErr w:type="gramStart"/>
+      <w:r>
+        <w:t>DAST</w:t>
+      </w:r>
+      <w:proofErr w:type="gramEnd"/>
+      <w:r>
+        <w:t xml:space="preserve"> but I ran out of time.</w:t>
+      </w:r>
+    </w:p>
+    <w:p>
+      <w:pPr>
+        <w:pStyle w:val="Otsikko3"/>
+      </w:pPr>
+      <w:bookmarkStart w:id="8" w:name="_Toc229836492"/>
+      <w:r>
+        <w:t>Security issues and vulnerabilities</w:t>
+      </w:r>
+      <w:bookmarkEnd w:id="8"/>
+    </w:p>
+    <w:p>
+      <w:r>
+        <w:t xml:space="preserve">Big security issue itself is the fact that project is missing SCA and DAST completely. </w:t>
+      </w:r>
+      <w:r>
+        <w:t xml:space="preserve">Some minor DAST testing was done manually, but it should be automated. </w:t>
+      </w:r>
+      <w:r>
+        <w:t xml:space="preserve">Also not using the latest version of Catch2 is a major security issue. </w:t>
+      </w:r>
+      <w:r>
+        <w:t>However,</w:t>
+      </w:r>
+      <w:r>
+        <w:t xml:space="preserve"> as project only runs locally and offline it requires an attack originating from user’s own hardware. These should be </w:t>
+      </w:r>
+      <w:r>
+        <w:t>fixed,</w:t>
+      </w:r>
+      <w:r>
+        <w:t xml:space="preserve"> nevertheless.</w:t>
+      </w:r>
+    </w:p>
+    <w:p>
+      <w:proofErr w:type="spellStart"/>
+      <w:r>
+        <w:t>SonarCloud</w:t>
+      </w:r>
+      <w:proofErr w:type="spellEnd"/>
+      <w:r>
+        <w:t xml:space="preserve"> shows 19 medium issues and 2 low issues. </w:t>
+      </w:r>
+    </w:p>
+    <w:p>
+      <w:r>
+        <w:t xml:space="preserve">Master password or passwords in general are not prompted to be secure enough </w:t>
+      </w:r>
+      <w:r>
+        <w:t>now;</w:t>
+      </w:r>
+      <w:r>
+        <w:t xml:space="preserve"> this should be addressed to the user.</w:t>
+      </w:r>
+    </w:p>
+    <w:p>
+      <w:pPr>
+        <w:pStyle w:val="Otsikko3"/>
+      </w:pPr>
+      <w:bookmarkStart w:id="9" w:name="_Toc229836493"/>
+      <w:r>
+        <w:t>Use of AI</w:t>
+      </w:r>
+      <w:bookmarkEnd w:id="9"/>
+    </w:p>
+    <w:p>
+      <w:r>
+        <w:t xml:space="preserve">AI was used as </w:t>
+      </w:r>
+      <w:r>
+        <w:t>a</w:t>
+      </w:r>
+      <w:r>
+        <w:t xml:space="preserve"> development tool for programming in this course. AI in use was </w:t>
+      </w:r>
+      <w:r>
+        <w:t xml:space="preserve">mainly </w:t>
+      </w:r>
+      <w:r>
+        <w:t>ChatGPT’s latest version GPT-5.5</w:t>
+      </w:r>
+      <w:r>
+        <w:t xml:space="preserve">, but the latest version of GitHub Copilot on </w:t>
+      </w:r>
+      <w:proofErr w:type="spellStart"/>
+      <w:r>
+        <w:t>VSCode</w:t>
+      </w:r>
+      <w:proofErr w:type="spellEnd"/>
+      <w:r>
+        <w:t xml:space="preserve"> was also tested</w:t>
+      </w:r>
+      <w:r>
+        <w:t xml:space="preserve">. </w:t>
+      </w:r>
+      <w:r>
+        <w:t>However, as GitHub Copilot was quite slow and unhelpful I think none of the information it gave is used on this project.</w:t>
+      </w:r>
+    </w:p>
+    <w:p>
+      <w:r>
+        <w:t>GPT-5.5</w:t>
+      </w:r>
+      <w:r>
+        <w:t xml:space="preserve"> was used for troubleshooting any issues on the code, for example the error output of </w:t>
+      </w:r>
+      <w:r>
+        <w:t>Command Prompt</w:t>
+      </w:r>
+      <w:r>
+        <w:t xml:space="preserve"> when program was </w:t>
+      </w:r>
+      <w:r>
+        <w:t>executed locally.</w:t>
+      </w:r>
+      <w:r>
+        <w:t xml:space="preserve"> </w:t>
+      </w:r>
+      <w:r>
+        <w:t>Exception information</w:t>
+      </w:r>
+      <w:r>
+        <w:t xml:space="preserve"> </w:t>
+      </w:r>
+      <w:r>
+        <w:t xml:space="preserve">was </w:t>
+      </w:r>
+      <w:r>
+        <w:t xml:space="preserve">given to the AI </w:t>
+      </w:r>
+      <w:r>
+        <w:t>and</w:t>
+      </w:r>
+      <w:r>
+        <w:t xml:space="preserve"> on the later stages</w:t>
+      </w:r>
+      <w:r>
+        <w:t xml:space="preserve"> the </w:t>
+      </w:r>
+      <w:r>
+        <w:t>build errors</w:t>
+      </w:r>
+      <w:r>
+        <w:t xml:space="preserve"> arisen in GitHub actions. AI was used together with external library documentation to produce some of the code, for example </w:t>
+      </w:r>
+      <w:r>
+        <w:t xml:space="preserve">for the parts with </w:t>
+      </w:r>
+      <w:proofErr w:type="spellStart"/>
+      <w:r>
+        <w:t>Libsodium</w:t>
+      </w:r>
+      <w:proofErr w:type="spellEnd"/>
+      <w:r>
+        <w:t xml:space="preserve"> where encryption and decryption was done</w:t>
+      </w:r>
+      <w:r>
+        <w:t>.</w:t>
+      </w:r>
+      <w:r>
+        <w:t xml:space="preserve"> The reason for this was that it was much faster than using the documentation only as I had not used the library before. All the code suggestions and other proposals from AI we’re manually reviewed especially taking security into account before being implemented.</w:t>
+      </w:r>
+      <w:r>
+        <w:t xml:space="preserve"> </w:t>
+      </w:r>
+    </w:p>
+    <w:p>
+      <w:pPr>
         <w:pStyle w:val="Luettelokappale"/>
-        <w:rPr>
-          <w:lang w:val="en-GB"/>
-        </w:rPr>
       </w:pPr>
     </w:p>
     <w:sectPr>
@@ -3302,6 +3608,9 @@
   <w:style w:type="paragraph" w:default="1" w:styleId="Normaali">
     <w:name w:val="Normal"/>
     <w:qFormat/>
+    <w:rPr>
+      <w:lang w:val="en-GB"/>
+    </w:rPr>
   </w:style>
   <w:style w:type="paragraph" w:styleId="Otsikko1">
     <w:name w:val="heading 1"/>
@@ -3935,6 +4244,32 @@
       <w:shd w:val="clear" w:color="auto" w:fill="E1DFDD"/>
     </w:rPr>
   </w:style>
+  <w:style w:type="paragraph" w:styleId="Sisluet2">
+    <w:name w:val="toc 2"/>
+    <w:basedOn w:val="Normaali"/>
+    <w:next w:val="Normaali"/>
+    <w:autoRedefine/>
+    <w:uiPriority w:val="39"/>
+    <w:unhideWhenUsed/>
+    <w:rsid w:val="0060271D"/>
+    <w:pPr>
+      <w:spacing w:after="100"/>
+      <w:ind w:left="240"/>
+    </w:pPr>
+  </w:style>
+  <w:style w:type="paragraph" w:styleId="Sisluet3">
+    <w:name w:val="toc 3"/>
+    <w:basedOn w:val="Normaali"/>
+    <w:next w:val="Normaali"/>
+    <w:autoRedefine/>
+    <w:uiPriority w:val="39"/>
+    <w:unhideWhenUsed/>
+    <w:rsid w:val="0060271D"/>
+    <w:pPr>
+      <w:spacing w:after="100"/>
+      <w:ind w:left="480"/>
+    </w:pPr>
+  </w:style>
 </w:styles>
 </file>
 

</xml_diff>